<commit_message>
Remove standalone report cover
</commit_message>
<xml_diff>
--- a/Find-Engine_中文研究报告_论文版.docx
+++ b/Find-Engine_中文研究报告_论文版.docx
@@ -4,41 +4,24 @@
   <w:body>
     <w:p>
       <w:pPr>
-        <w:spacing w:after="240"/>
+        <w:keepNext/>
+        <w:keepLines/>
+        <w:spacing w:after="120"/>
+        <w:jc w:val="center"/>
       </w:pPr>
+      <w:r>
+        <w:rPr>
+          <w:rFonts w:ascii="Times New Roman" w:hAnsi="Times New Roman" w:eastAsia="微软雅黑" w:cs="Times New Roman"/>
+          <w:b/>
+          <w:color w:val="17365D"/>
+          <w:sz w:val="40"/>
+        </w:rPr>
+        <w:t>Find-Engine：面向成对数学 PDF 的</w:t>
+      </w:r>
     </w:p>
     <w:p>
       <w:pPr>
-        <w:spacing w:after="240"/>
-      </w:pPr>
-    </w:p>
-    <w:p>
-      <w:pPr>
-        <w:spacing w:after="240"/>
-      </w:pPr>
-    </w:p>
-    <w:p>
-      <w:pPr>
-        <w:spacing w:after="240"/>
-      </w:pPr>
-    </w:p>
-    <w:p>
-      <w:pPr>
-        <w:spacing w:after="320"/>
-        <w:jc w:val="center"/>
-      </w:pPr>
-      <w:r>
-        <w:rPr>
-          <w:rFonts w:ascii="Times New Roman" w:hAnsi="Times New Roman" w:eastAsia="微软雅黑" w:cs="Times New Roman"/>
-          <w:b/>
-          <w:color w:val="B08D57"/>
-          <w:sz w:val="22"/>
-        </w:rPr>
-        <w:t>技术研究报告</w:t>
-      </w:r>
-    </w:p>
-    <w:p>
-      <w:pPr>
+        <w:keepNext/>
         <w:keepLines/>
         <w:spacing w:after="160"/>
         <w:jc w:val="center"/>
@@ -47,87 +30,28 @@
         <w:rPr>
           <w:rFonts w:ascii="Times New Roman" w:hAnsi="Times New Roman" w:eastAsia="微软雅黑" w:cs="Times New Roman"/>
           <w:b/>
-          <w:color w:val="17365D"/>
-          <w:sz w:val="60"/>
-        </w:rPr>
-        <w:t>Find-Engine</w:t>
+          <w:color w:val="2F6B73"/>
+          <w:sz w:val="36"/>
+        </w:rPr>
+        <w:t>确定性题目-答案对齐</w:t>
       </w:r>
     </w:p>
     <w:p>
       <w:pPr>
-        <w:keepLines/>
-        <w:spacing w:after="360"/>
+        <w:keepNext/>
+        <w:spacing w:after="240"/>
         <w:jc w:val="center"/>
         <w:pBdr>
-          <w:bottom w:val="single" w:sz="12" w:space="12" w:color="B08D57"/>
+          <w:bottom w:val="single" w:sz="8" w:space="8" w:color="B08D57"/>
         </w:pBdr>
       </w:pPr>
       <w:r>
         <w:rPr>
           <w:rFonts w:ascii="Times New Roman" w:hAnsi="Times New Roman" w:eastAsia="微软雅黑" w:cs="Times New Roman"/>
-          <w:b/>
-          <w:color w:val="2F6B73"/>
-          <w:sz w:val="36"/>
-        </w:rPr>
-        <w:t>面向成对数学 PDF 的</w:t>
-        <w:br/>
-        <w:t>确定性题目-答案对齐</w:t>
-      </w:r>
-    </w:p>
-    <w:p>
-      <w:pPr>
-        <w:spacing w:before="480" w:after="100"/>
-        <w:jc w:val="center"/>
-      </w:pPr>
-      <w:r>
-        <w:rPr>
-          <w:rFonts w:ascii="Times New Roman" w:hAnsi="Times New Roman" w:eastAsia="微软雅黑" w:cs="Times New Roman"/>
           <w:color w:val="5F6B76"/>
-          <w:sz w:val="21"/>
-        </w:rPr>
-        <w:t>版本 2.1</w:t>
-      </w:r>
-    </w:p>
-    <w:p>
-      <w:pPr>
-        <w:spacing w:after="100"/>
-        <w:jc w:val="center"/>
-      </w:pPr>
-      <w:r>
-        <w:rPr>
-          <w:rFonts w:ascii="Times New Roman" w:hAnsi="Times New Roman" w:eastAsia="微软雅黑" w:cs="Times New Roman"/>
-          <w:color w:val="5F6B76"/>
-          <w:sz w:val="21"/>
-        </w:rPr>
-        <w:t>2026 年 8 月 30 日</w:t>
-      </w:r>
-    </w:p>
-    <w:p>
-      <w:pPr>
-        <w:spacing w:after="260"/>
-      </w:pPr>
-    </w:p>
-    <w:p>
-      <w:pPr>
-        <w:spacing w:after="260"/>
-      </w:pPr>
-    </w:p>
-    <w:p>
-      <w:pPr>
-        <w:spacing w:after="260"/>
-      </w:pPr>
-    </w:p>
-    <w:p>
-      <w:pPr>
-        <w:spacing w:after="260"/>
-      </w:pPr>
-    </w:p>
-    <w:p>
-      <w:pPr>
-        <w:spacing w:after="260"/>
-      </w:pPr>
-      <w:r>
-        <w:br w:type="page"/>
+          <w:sz w:val="19"/>
+        </w:rPr>
+        <w:t>版本 2.1　2026 年 8 月 30 日</w:t>
       </w:r>
     </w:p>
     <w:p>
@@ -15488,6 +15412,7 @@
     <w:p>
       <w:pPr>
         <w:pStyle w:val="Heading1"/>
+        <w:pageBreakBefore/>
       </w:pPr>
       <w:r>
         <w:rPr>
@@ -16562,7 +16487,6 @@
       <w:pgSz w:w="11906" w:h="16838"/>
       <w:pgMar w:top="1446" w:right="1389" w:bottom="1389" w:left="1559" w:header="709" w:footer="709" w:gutter="0"/>
       <w:cols w:space="720"/>
-      <w:titlePg/>
       <w:docGrid w:linePitch="360"/>
     </w:sectPr>
   </w:body>

</xml_diff>